<commit_message>
Move assignment/quiz due dates onto Mondays and Wednesdays
Every Fall due date was landing on a Sunday, which does not match the Tue/Thu
session table students actually follow. Each chapter is now due the night before
a class day — Monday or Wednesday — roughly six days after its last session and
always before the exam that covers it.

  Ch 1  Mon Aug 31      Ch 7   Mon Nov 2
  Ch 2  Wed Sep 9       Ch 8   Mon Nov 9
  Ch 3  Mon Sep 28      Ch 9   Wed Nov 18
  Ch 4  Mon Oct 5       Ch 11  Mon Nov 23
  Ch 5  Mon Oct 19      Ch 12  Wed Nov 25
  Ch 6  Mon Oct 26      Ch 13  Mon Nov 30

Spring 2027 is left alone: it meets Mon/Wed, so its existing Sunday dates are
already the night before a class day.

Co-Authored-By: Claude Opus 5 <noreply@anthropic.com>
</commit_message>
<xml_diff>
--- a/2026fall/ACCT2101B_Fall2026 Course Schedule.docx
+++ b/2026fall/ACCT2101B_Fall2026 Course Schedule.docx
@@ -1360,7 +1360,7 @@
                 <w:sz w:val="24"/>
                 <w:szCs w:val="24"/>
               </w:rPr>
-              <w:t>30 (Sun)</w:t>
+              <w:t>31 (Mon)</w:t>
             </w:r>
           </w:p>
         </w:tc>
@@ -1589,7 +1589,7 @@
                 <w:sz w:val="24"/>
                 <w:szCs w:val="24"/>
               </w:rPr>
-              <w:t>13 (Sun)</w:t>
+              <w:t>9 (Wed)</w:t>
             </w:r>
           </w:p>
         </w:tc>
@@ -2173,7 +2173,7 @@
                 <w:sz w:val="24"/>
                 <w:szCs w:val="24"/>
               </w:rPr>
-              <w:t>27 (Sun)</w:t>
+              <w:t>28 (Mon)</w:t>
             </w:r>
           </w:p>
         </w:tc>
@@ -2402,7 +2402,7 @@
                 <w:sz w:val="24"/>
                 <w:szCs w:val="24"/>
               </w:rPr>
-              <w:t>4 (Sun)</w:t>
+              <w:t>5 (Mon)</w:t>
             </w:r>
           </w:p>
         </w:tc>
@@ -2757,7 +2757,7 @@
                 <w:sz w:val="24"/>
                 <w:szCs w:val="24"/>
               </w:rPr>
-              <w:t>18 (Sun)</w:t>
+              <w:t>19 (Mon)</w:t>
             </w:r>
           </w:p>
         </w:tc>
@@ -2986,7 +2986,7 @@
                 <w:sz w:val="24"/>
                 <w:szCs w:val="24"/>
               </w:rPr>
-              <w:t>25 (Sun)</w:t>
+              <w:t>26 (Mon)</w:t>
             </w:r>
           </w:p>
         </w:tc>
@@ -3215,7 +3215,7 @@
                 <w:sz w:val="24"/>
                 <w:szCs w:val="24"/>
               </w:rPr>
-              <w:t>1 (Sun)</w:t>
+              <w:t>2 (Mon)</w:t>
             </w:r>
           </w:p>
         </w:tc>
@@ -3444,7 +3444,7 @@
                 <w:sz w:val="24"/>
                 <w:szCs w:val="24"/>
               </w:rPr>
-              <w:t>8 (Sun)</w:t>
+              <w:t>9 (Mon)</w:t>
             </w:r>
           </w:p>
         </w:tc>
@@ -3799,7 +3799,7 @@
                 <w:sz w:val="24"/>
                 <w:szCs w:val="24"/>
               </w:rPr>
-              <w:t>15 (Sun)</w:t>
+              <w:t>18 (Wed)</w:t>
             </w:r>
           </w:p>
         </w:tc>
@@ -4028,7 +4028,7 @@
                 <w:sz w:val="24"/>
                 <w:szCs w:val="24"/>
               </w:rPr>
-              <w:t>22 (Sun)</w:t>
+              <w:t>23 (Mon)</w:t>
             </w:r>
           </w:p>
         </w:tc>
@@ -4257,7 +4257,7 @@
                 <w:sz w:val="24"/>
                 <w:szCs w:val="24"/>
               </w:rPr>
-              <w:t>29 (Sun)</w:t>
+              <w:t>25 (Wed)</w:t>
             </w:r>
           </w:p>
         </w:tc>
@@ -4454,6 +4454,7 @@
                 <w:sz w:val="24"/>
                 <w:szCs w:val="24"/>
               </w:rPr>
+              <w:t>Nov</w:t>
             </w:r>
           </w:p>
         </w:tc>
@@ -4485,6 +4486,7 @@
                 <w:sz w:val="24"/>
                 <w:szCs w:val="24"/>
               </w:rPr>
+              <w:t>30 (Mon)</w:t>
             </w:r>
           </w:p>
         </w:tc>
@@ -5280,7 +5282,7 @@
                 <w:b/>
                 <w:color w:val="C00000"/>
               </w:rPr>
-              <w:t xml:space="preserve">   (Ch. 1 Assignment &amp; Quiz#1 due 08/30)</w:t>
+              <w:t xml:space="preserve">   (Ch. 1 Assignment &amp; Quiz#1 due 08/31)</w:t>
             </w:r>
           </w:p>
         </w:tc>
@@ -5445,6 +5447,13 @@
             </w:pPr>
             <w:r>
               <w:t>Ch. 2 — Recording Business Transactions</w:t>
+            </w:r>
+            <w:r>
+              <w:rPr>
+                <w:b/>
+                <w:color w:val="C00000"/>
+              </w:rPr>
+              <w:t xml:space="preserve">   (Ch. 2 Assignment &amp; Quiz#2 due 09/09)</w:t>
             </w:r>
           </w:p>
         </w:tc>
@@ -5618,12 +5627,347 @@
             <w:r>
               <w:t>Ch. 1 &amp; 2 Review (Ch1-2 Practice Test)</w:t>
             </w:r>
+          </w:p>
+        </w:tc>
+      </w:tr>
+      <w:tr>
+        <w:tc>
+          <w:tcPr>
+            <w:tcW w:w="440" w:type="pct"/>
+            <w:shd w:val="clear" w:color="auto" w:fill="auto"/>
+            <w:vAlign w:val="center"/>
+          </w:tcPr>
+          <w:p>
+            <w:pPr>
+              <w:jc w:val="center"/>
+              <w:rPr>
+                <w:lang w:eastAsia="ko-KR"/>
+              </w:rPr>
+            </w:pPr>
+            <w:r>
+              <w:rPr>
+                <w:rFonts w:hint="eastAsia"/>
+                <w:sz w:val="22"/>
+                <w:szCs w:val="22"/>
+                <w:lang w:eastAsia="ko-KR"/>
+              </w:rPr>
+              <w:t>8</w:t>
+            </w:r>
+          </w:p>
+        </w:tc>
+        <w:tc>
+          <w:tcPr>
+            <w:tcW w:w="850" w:type="pct"/>
+            <w:shd w:val="clear" w:color="auto" w:fill="auto"/>
+            <w:vAlign w:val="center"/>
+          </w:tcPr>
+          <w:p>
+            <w:pPr>
+              <w:ind w:rightChars="31" w:right="62"/>
+              <w:jc w:val="center"/>
+              <w:rPr>
+                <w:lang w:eastAsia="ko-KR"/>
+              </w:rPr>
+            </w:pPr>
+            <w:r>
+              <w:rPr>
+                <w:sz w:val="22"/>
+                <w:szCs w:val="22"/>
+              </w:rPr>
+              <w:t>09/15 (Tue)</w:t>
+            </w:r>
+            <w:r>
+              <w:rPr>
+                <w:sz w:val="22"/>
+                <w:szCs w:val="22"/>
+              </w:rPr>
+            </w:r>
+            <w:r>
+              <w:rPr>
+                <w:sz w:val="22"/>
+                <w:szCs w:val="22"/>
+              </w:rPr>
+            </w:r>
+            <w:r>
+              <w:rPr>
+                <w:sz w:val="22"/>
+                <w:szCs w:val="22"/>
+              </w:rPr>
+            </w:r>
+          </w:p>
+        </w:tc>
+        <w:tc>
+          <w:tcPr>
+            <w:tcW w:w="3710" w:type="pct"/>
+            <w:shd w:val="clear" w:color="auto" w:fill="auto"/>
+            <w:vAlign w:val="center"/>
+          </w:tcPr>
+          <w:p>
+            <w:pPr>
+              <w:jc w:val="both"/>
+            </w:pPr>
+            <w:r>
+              <w:t>1st Exam: Ch. 1 &amp; 2</w:t>
+            </w:r>
+            <w:r>
+              <w:rPr>
+                <w:b/>
+                <w:color w:val="0070C0"/>
+              </w:rPr>
+              <w:t xml:space="preserve">   (IN PERSON — bring laptop &amp; student ID)</w:t>
+            </w:r>
+          </w:p>
+        </w:tc>
+      </w:tr>
+      <w:tr>
+        <w:tc>
+          <w:tcPr>
+            <w:tcW w:w="440" w:type="pct"/>
+            <w:shd w:val="clear" w:color="auto" w:fill="auto"/>
+            <w:vAlign w:val="center"/>
+          </w:tcPr>
+          <w:p>
+            <w:pPr>
+              <w:jc w:val="center"/>
+              <w:rPr>
+                <w:lang w:eastAsia="ko-KR"/>
+              </w:rPr>
+            </w:pPr>
+            <w:r>
+              <w:rPr>
+                <w:rFonts w:hint="eastAsia"/>
+                <w:sz w:val="22"/>
+                <w:szCs w:val="22"/>
+                <w:lang w:eastAsia="ko-KR"/>
+              </w:rPr>
+              <w:t>9</w:t>
+            </w:r>
+          </w:p>
+        </w:tc>
+        <w:tc>
+          <w:tcPr>
+            <w:tcW w:w="850" w:type="pct"/>
+            <w:shd w:val="clear" w:color="auto" w:fill="auto"/>
+            <w:vAlign w:val="center"/>
+          </w:tcPr>
+          <w:p>
+            <w:pPr>
+              <w:ind w:rightChars="31" w:right="62"/>
+              <w:jc w:val="center"/>
+              <w:rPr>
+                <w:lang w:eastAsia="ko-KR"/>
+              </w:rPr>
+            </w:pPr>
+            <w:r>
+              <w:rPr>
+                <w:sz w:val="22"/>
+                <w:szCs w:val="22"/>
+              </w:rPr>
+              <w:t>09/17 (Thu)</w:t>
+            </w:r>
+            <w:r>
+              <w:rPr>
+                <w:sz w:val="22"/>
+                <w:szCs w:val="22"/>
+              </w:rPr>
+            </w:r>
+            <w:r>
+              <w:rPr>
+                <w:sz w:val="22"/>
+                <w:szCs w:val="22"/>
+              </w:rPr>
+            </w:r>
+            <w:r>
+              <w:rPr>
+                <w:sz w:val="22"/>
+                <w:szCs w:val="22"/>
+              </w:rPr>
+            </w:r>
+          </w:p>
+        </w:tc>
+        <w:tc>
+          <w:tcPr>
+            <w:tcW w:w="3710" w:type="pct"/>
+            <w:shd w:val="clear" w:color="auto" w:fill="auto"/>
+            <w:vAlign w:val="center"/>
+          </w:tcPr>
+          <w:p>
+            <w:pPr>
+              <w:jc w:val="both"/>
+            </w:pPr>
+            <w:r>
+              <w:t>Ch. 3 — The Adjusting Process</w:t>
+            </w:r>
+          </w:p>
+        </w:tc>
+      </w:tr>
+      <w:tr>
+        <w:tc>
+          <w:tcPr>
+            <w:tcW w:w="440" w:type="pct"/>
+            <w:shd w:val="clear" w:color="auto" w:fill="auto"/>
+            <w:vAlign w:val="center"/>
+          </w:tcPr>
+          <w:p>
+            <w:pPr>
+              <w:jc w:val="center"/>
+              <w:rPr>
+                <w:lang w:eastAsia="ko-KR"/>
+              </w:rPr>
+            </w:pPr>
+            <w:r>
+              <w:rPr>
+                <w:rFonts w:hint="eastAsia"/>
+                <w:sz w:val="22"/>
+                <w:szCs w:val="22"/>
+                <w:lang w:eastAsia="ko-KR"/>
+              </w:rPr>
+              <w:t>10</w:t>
+            </w:r>
+          </w:p>
+        </w:tc>
+        <w:tc>
+          <w:tcPr>
+            <w:tcW w:w="850" w:type="pct"/>
+            <w:shd w:val="clear" w:color="auto" w:fill="auto"/>
+            <w:vAlign w:val="center"/>
+          </w:tcPr>
+          <w:p>
+            <w:pPr>
+              <w:ind w:rightChars="31" w:right="62"/>
+              <w:jc w:val="center"/>
+              <w:rPr>
+                <w:lang w:eastAsia="ko-KR"/>
+              </w:rPr>
+            </w:pPr>
+            <w:r>
+              <w:rPr>
+                <w:sz w:val="22"/>
+                <w:szCs w:val="22"/>
+              </w:rPr>
+              <w:t>09/22 (Tue)</w:t>
+            </w:r>
+            <w:r>
+              <w:rPr>
+                <w:sz w:val="22"/>
+                <w:szCs w:val="22"/>
+              </w:rPr>
+            </w:r>
+            <w:r>
+              <w:rPr>
+                <w:sz w:val="22"/>
+                <w:szCs w:val="22"/>
+              </w:rPr>
+            </w:r>
+            <w:r>
+              <w:rPr>
+                <w:sz w:val="22"/>
+                <w:szCs w:val="22"/>
+              </w:rPr>
+            </w:r>
+          </w:p>
+        </w:tc>
+        <w:tc>
+          <w:tcPr>
+            <w:tcW w:w="3710" w:type="pct"/>
+            <w:shd w:val="clear" w:color="auto" w:fill="auto"/>
+            <w:vAlign w:val="center"/>
+          </w:tcPr>
+          <w:p>
+            <w:pPr>
+              <w:jc w:val="both"/>
+            </w:pPr>
+            <w:r>
+              <w:t>Ch. 3 — The Adjusting Process</w:t>
+            </w:r>
+          </w:p>
+        </w:tc>
+      </w:tr>
+      <w:tr>
+        <w:tc>
+          <w:tcPr>
+            <w:tcW w:w="440" w:type="pct"/>
+            <w:shd w:val="clear" w:color="auto" w:fill="auto"/>
+            <w:vAlign w:val="center"/>
+          </w:tcPr>
+          <w:p>
+            <w:pPr>
+              <w:jc w:val="center"/>
+              <w:rPr>
+                <w:lang w:eastAsia="ko-KR"/>
+              </w:rPr>
+            </w:pPr>
+            <w:r>
+              <w:rPr>
+                <w:rFonts w:hint="eastAsia"/>
+                <w:sz w:val="22"/>
+                <w:szCs w:val="22"/>
+                <w:lang w:eastAsia="ko-KR"/>
+              </w:rPr>
+              <w:t>11</w:t>
+            </w:r>
+          </w:p>
+        </w:tc>
+        <w:tc>
+          <w:tcPr>
+            <w:tcW w:w="850" w:type="pct"/>
+            <w:shd w:val="clear" w:color="auto" w:fill="auto"/>
+            <w:vAlign w:val="center"/>
+          </w:tcPr>
+          <w:p>
+            <w:pPr>
+              <w:ind w:rightChars="31" w:right="62"/>
+              <w:jc w:val="center"/>
+              <w:rPr>
+                <w:lang w:eastAsia="ko-KR"/>
+              </w:rPr>
+            </w:pPr>
+            <w:r>
+              <w:rPr>
+                <w:sz w:val="22"/>
+                <w:szCs w:val="22"/>
+              </w:rPr>
+              <w:t>09/24 (Thu)</w:t>
+            </w:r>
+            <w:r>
+              <w:rPr>
+                <w:sz w:val="22"/>
+                <w:szCs w:val="22"/>
+              </w:rPr>
+            </w:r>
+            <w:r>
+              <w:rPr>
+                <w:sz w:val="22"/>
+                <w:szCs w:val="22"/>
+              </w:rPr>
+            </w:r>
+            <w:r>
+              <w:rPr>
+                <w:sz w:val="22"/>
+                <w:szCs w:val="22"/>
+              </w:rPr>
+            </w:r>
+          </w:p>
+        </w:tc>
+        <w:tc>
+          <w:tcPr>
+            <w:tcW w:w="3710" w:type="pct"/>
+            <w:shd w:val="clear" w:color="auto" w:fill="auto"/>
+            <w:vAlign w:val="center"/>
+          </w:tcPr>
+          <w:p>
+            <w:pPr>
+              <w:jc w:val="both"/>
+            </w:pPr>
+            <w:r>
+              <w:t>Ch. 3 — The Adjusting Process</w:t>
+            </w:r>
             <w:r>
               <w:rPr>
                 <w:b/>
                 <w:color w:val="C00000"/>
               </w:rPr>
-              <w:t xml:space="preserve">   (Ch. 2 Assignment &amp; Quiz#2 due 09/13)</w:t>
+              <w:t xml:space="preserve">   (Ch. 3 Assignment &amp; Quiz#3 due 09/28)</w:t>
             </w:r>
           </w:p>
         </w:tc>
@@ -5649,7 +5993,7 @@
                 <w:szCs w:val="22"/>
                 <w:lang w:eastAsia="ko-KR"/>
               </w:rPr>
-              <w:t>8</w:t>
+              <w:t>12</w:t>
             </w:r>
           </w:p>
         </w:tc>
@@ -5672,7 +6016,7 @@
                 <w:sz w:val="22"/>
                 <w:szCs w:val="22"/>
               </w:rPr>
-              <w:t>09/15 (Tue)</w:t>
+              <w:t>09/29 (Tue)</w:t>
             </w:r>
             <w:r>
               <w:rPr>
@@ -5705,7 +6049,260 @@
               <w:jc w:val="both"/>
             </w:pPr>
             <w:r>
-              <w:t>1st Exam: Ch. 1 &amp; 2</w:t>
+              <w:t>Ch. 4 — Completing the Accounting Cycle</w:t>
+            </w:r>
+          </w:p>
+        </w:tc>
+      </w:tr>
+      <w:tr>
+        <w:tc>
+          <w:tcPr>
+            <w:tcW w:w="440" w:type="pct"/>
+            <w:shd w:val="clear" w:color="auto" w:fill="auto"/>
+            <w:vAlign w:val="center"/>
+          </w:tcPr>
+          <w:p>
+            <w:pPr>
+              <w:jc w:val="center"/>
+              <w:rPr>
+                <w:lang w:eastAsia="ko-KR"/>
+              </w:rPr>
+            </w:pPr>
+            <w:r>
+              <w:rPr>
+                <w:rFonts w:hint="eastAsia"/>
+                <w:sz w:val="22"/>
+                <w:szCs w:val="22"/>
+                <w:lang w:eastAsia="ko-KR"/>
+              </w:rPr>
+              <w:t>13</w:t>
+            </w:r>
+          </w:p>
+        </w:tc>
+        <w:tc>
+          <w:tcPr>
+            <w:tcW w:w="850" w:type="pct"/>
+            <w:shd w:val="clear" w:color="auto" w:fill="auto"/>
+            <w:vAlign w:val="center"/>
+          </w:tcPr>
+          <w:p>
+            <w:pPr>
+              <w:ind w:rightChars="31" w:right="62"/>
+              <w:jc w:val="center"/>
+              <w:rPr>
+                <w:lang w:eastAsia="ko-KR"/>
+              </w:rPr>
+            </w:pPr>
+            <w:r>
+              <w:rPr>
+                <w:sz w:val="22"/>
+                <w:szCs w:val="22"/>
+              </w:rPr>
+              <w:t>10/01 (Thu)</w:t>
+            </w:r>
+            <w:r>
+              <w:rPr>
+                <w:sz w:val="22"/>
+                <w:szCs w:val="22"/>
+              </w:rPr>
+            </w:r>
+            <w:r>
+              <w:rPr>
+                <w:sz w:val="22"/>
+                <w:szCs w:val="22"/>
+              </w:rPr>
+            </w:r>
+            <w:r>
+              <w:rPr>
+                <w:sz w:val="22"/>
+                <w:szCs w:val="22"/>
+              </w:rPr>
+            </w:r>
+          </w:p>
+        </w:tc>
+        <w:tc>
+          <w:tcPr>
+            <w:tcW w:w="3710" w:type="pct"/>
+            <w:shd w:val="clear" w:color="auto" w:fill="auto"/>
+            <w:vAlign w:val="center"/>
+          </w:tcPr>
+          <w:p>
+            <w:pPr>
+              <w:jc w:val="both"/>
+            </w:pPr>
+            <w:r>
+              <w:t>Ch. 4 — Completing the Accounting Cycle</w:t>
+            </w:r>
+            <w:r>
+              <w:rPr>
+                <w:b/>
+                <w:color w:val="C00000"/>
+              </w:rPr>
+              <w:t xml:space="preserve">   (Ch. 4 Assignment &amp; Quiz#4 due 10/05)</w:t>
+            </w:r>
+          </w:p>
+        </w:tc>
+      </w:tr>
+      <w:tr>
+        <w:tc>
+          <w:tcPr>
+            <w:tcW w:w="440" w:type="pct"/>
+            <w:shd w:val="clear" w:color="auto" w:fill="auto"/>
+            <w:vAlign w:val="center"/>
+          </w:tcPr>
+          <w:p>
+            <w:pPr>
+              <w:jc w:val="center"/>
+              <w:rPr>
+                <w:lang w:eastAsia="ko-KR"/>
+              </w:rPr>
+            </w:pPr>
+            <w:r>
+              <w:rPr>
+                <w:rFonts w:hint="eastAsia"/>
+                <w:sz w:val="22"/>
+                <w:szCs w:val="22"/>
+                <w:lang w:eastAsia="ko-KR"/>
+              </w:rPr>
+              <w:t>14</w:t>
+            </w:r>
+          </w:p>
+        </w:tc>
+        <w:tc>
+          <w:tcPr>
+            <w:tcW w:w="850" w:type="pct"/>
+            <w:shd w:val="clear" w:color="auto" w:fill="auto"/>
+            <w:vAlign w:val="center"/>
+          </w:tcPr>
+          <w:p>
+            <w:pPr>
+              <w:ind w:rightChars="31" w:right="62"/>
+              <w:jc w:val="center"/>
+              <w:rPr>
+                <w:lang w:eastAsia="ko-KR"/>
+              </w:rPr>
+            </w:pPr>
+            <w:r>
+              <w:rPr>
+                <w:sz w:val="22"/>
+                <w:szCs w:val="22"/>
+              </w:rPr>
+              <w:t>10/06 (Tue)</w:t>
+            </w:r>
+            <w:r>
+              <w:rPr>
+                <w:sz w:val="22"/>
+                <w:szCs w:val="22"/>
+              </w:rPr>
+            </w:r>
+            <w:r>
+              <w:rPr>
+                <w:sz w:val="22"/>
+                <w:szCs w:val="22"/>
+              </w:rPr>
+            </w:r>
+            <w:r>
+              <w:rPr>
+                <w:sz w:val="22"/>
+                <w:szCs w:val="22"/>
+              </w:rPr>
+            </w:r>
+          </w:p>
+        </w:tc>
+        <w:tc>
+          <w:tcPr>
+            <w:tcW w:w="3710" w:type="pct"/>
+            <w:shd w:val="clear" w:color="auto" w:fill="auto"/>
+            <w:vAlign w:val="center"/>
+          </w:tcPr>
+          <w:p>
+            <w:pPr>
+              <w:jc w:val="both"/>
+            </w:pPr>
+            <w:r>
+              <w:t>Ch. 3 &amp; 4 Review</w:t>
+            </w:r>
+          </w:p>
+        </w:tc>
+      </w:tr>
+      <w:tr>
+        <w:tc>
+          <w:tcPr>
+            <w:tcW w:w="440" w:type="pct"/>
+            <w:shd w:val="clear" w:color="auto" w:fill="auto"/>
+            <w:vAlign w:val="center"/>
+          </w:tcPr>
+          <w:p>
+            <w:pPr>
+              <w:jc w:val="center"/>
+              <w:rPr>
+                <w:lang w:eastAsia="ko-KR"/>
+              </w:rPr>
+            </w:pPr>
+            <w:r>
+              <w:rPr>
+                <w:rFonts w:hint="eastAsia"/>
+                <w:sz w:val="22"/>
+                <w:szCs w:val="22"/>
+                <w:lang w:eastAsia="ko-KR"/>
+              </w:rPr>
+              <w:t>15</w:t>
+            </w:r>
+          </w:p>
+        </w:tc>
+        <w:tc>
+          <w:tcPr>
+            <w:tcW w:w="850" w:type="pct"/>
+            <w:shd w:val="clear" w:color="auto" w:fill="auto"/>
+            <w:vAlign w:val="center"/>
+          </w:tcPr>
+          <w:p>
+            <w:pPr>
+              <w:ind w:rightChars="31" w:right="62"/>
+              <w:jc w:val="center"/>
+              <w:rPr>
+                <w:lang w:eastAsia="ko-KR"/>
+              </w:rPr>
+            </w:pPr>
+            <w:r>
+              <w:rPr>
+                <w:sz w:val="22"/>
+                <w:szCs w:val="22"/>
+              </w:rPr>
+              <w:t>10/08 (Thu)</w:t>
+            </w:r>
+            <w:r>
+              <w:rPr>
+                <w:sz w:val="22"/>
+                <w:szCs w:val="22"/>
+              </w:rPr>
+            </w:r>
+            <w:r>
+              <w:rPr>
+                <w:sz w:val="22"/>
+                <w:szCs w:val="22"/>
+              </w:rPr>
+            </w:r>
+            <w:r>
+              <w:rPr>
+                <w:sz w:val="22"/>
+                <w:szCs w:val="22"/>
+              </w:rPr>
+            </w:r>
+          </w:p>
+        </w:tc>
+        <w:tc>
+          <w:tcPr>
+            <w:tcW w:w="3710" w:type="pct"/>
+            <w:shd w:val="clear" w:color="auto" w:fill="auto"/>
+            <w:vAlign w:val="center"/>
+          </w:tcPr>
+          <w:p>
+            <w:pPr>
+              <w:jc w:val="both"/>
+            </w:pPr>
+            <w:r>
+              <w:t>2nd Exam: Ch. 3 &amp; 4</w:t>
             </w:r>
             <w:r>
               <w:rPr>
@@ -5738,7 +6335,7 @@
                 <w:szCs w:val="22"/>
                 <w:lang w:eastAsia="ko-KR"/>
               </w:rPr>
-              <w:t>9</w:t>
+              <w:t>16</w:t>
             </w:r>
           </w:p>
         </w:tc>
@@ -5761,7 +6358,7 @@
                 <w:sz w:val="22"/>
                 <w:szCs w:val="22"/>
               </w:rPr>
-              <w:t>09/17 (Thu)</w:t>
+              <w:t>10/13 (Tue)</w:t>
             </w:r>
             <w:r>
               <w:rPr>
@@ -5794,7 +6391,7 @@
               <w:jc w:val="both"/>
             </w:pPr>
             <w:r>
-              <w:t>Ch. 3 — The Adjusting Process</w:t>
+              <w:t>Ch. 5 — Merchandising Operations</w:t>
             </w:r>
           </w:p>
         </w:tc>
@@ -5820,7 +6417,7 @@
                 <w:szCs w:val="22"/>
                 <w:lang w:eastAsia="ko-KR"/>
               </w:rPr>
-              <w:t>10</w:t>
+              <w:t>17</w:t>
             </w:r>
           </w:p>
         </w:tc>
@@ -5843,7 +6440,7 @@
                 <w:sz w:val="22"/>
                 <w:szCs w:val="22"/>
               </w:rPr>
-              <w:t>09/22 (Tue)</w:t>
+              <w:t>10/15 (Thu)</w:t>
             </w:r>
             <w:r>
               <w:rPr>
@@ -5876,7 +6473,14 @@
               <w:jc w:val="both"/>
             </w:pPr>
             <w:r>
-              <w:t>Ch. 3 — The Adjusting Process</w:t>
+              <w:t>Ch. 5 — Merchandising Operations</w:t>
+            </w:r>
+            <w:r>
+              <w:rPr>
+                <w:b/>
+                <w:color w:val="C00000"/>
+              </w:rPr>
+              <w:t xml:space="preserve">   (Ch. 5 Assignment &amp; Quiz#5 due 10/19)</w:t>
             </w:r>
           </w:p>
         </w:tc>
@@ -5902,7 +6506,7 @@
                 <w:szCs w:val="22"/>
                 <w:lang w:eastAsia="ko-KR"/>
               </w:rPr>
-              <w:t>11</w:t>
+              <w:t>18</w:t>
             </w:r>
           </w:p>
         </w:tc>
@@ -5925,7 +6529,7 @@
                 <w:sz w:val="22"/>
                 <w:szCs w:val="22"/>
               </w:rPr>
-              <w:t>09/24 (Thu)</w:t>
+              <w:t>10/20 (Tue)</w:t>
             </w:r>
             <w:r>
               <w:rPr>
@@ -5958,14 +6562,103 @@
               <w:jc w:val="both"/>
             </w:pPr>
             <w:r>
-              <w:t>Ch. 3 — The Adjusting Process</w:t>
+              <w:t>Ch. 6 — Merchandise Inventory</w:t>
+            </w:r>
+            <w:r>
+              <w:rPr>
+                <w:b/>
+                <w:color w:val="00B050"/>
+              </w:rPr>
+              <w:t xml:space="preserve">   (10/21 — Last day to withdraw with a “W”)</w:t>
+            </w:r>
+          </w:p>
+        </w:tc>
+      </w:tr>
+      <w:tr>
+        <w:tc>
+          <w:tcPr>
+            <w:tcW w:w="440" w:type="pct"/>
+            <w:shd w:val="clear" w:color="auto" w:fill="auto"/>
+            <w:vAlign w:val="center"/>
+          </w:tcPr>
+          <w:p>
+            <w:pPr>
+              <w:jc w:val="center"/>
+              <w:rPr>
+                <w:lang w:eastAsia="ko-KR"/>
+              </w:rPr>
+            </w:pPr>
+            <w:r>
+              <w:rPr>
+                <w:rFonts w:hint="eastAsia"/>
+                <w:sz w:val="22"/>
+                <w:szCs w:val="22"/>
+                <w:lang w:eastAsia="ko-KR"/>
+              </w:rPr>
+              <w:t>19</w:t>
+            </w:r>
+          </w:p>
+        </w:tc>
+        <w:tc>
+          <w:tcPr>
+            <w:tcW w:w="850" w:type="pct"/>
+            <w:shd w:val="clear" w:color="auto" w:fill="auto"/>
+            <w:vAlign w:val="center"/>
+          </w:tcPr>
+          <w:p>
+            <w:pPr>
+              <w:ind w:rightChars="31" w:right="62"/>
+              <w:jc w:val="center"/>
+              <w:rPr>
+                <w:lang w:eastAsia="ko-KR"/>
+              </w:rPr>
+            </w:pPr>
+            <w:r>
+              <w:rPr>
+                <w:sz w:val="22"/>
+                <w:szCs w:val="22"/>
+              </w:rPr>
+              <w:t>10/22 (Thu)</w:t>
+            </w:r>
+            <w:r>
+              <w:rPr>
+                <w:sz w:val="22"/>
+                <w:szCs w:val="22"/>
+              </w:rPr>
+            </w:r>
+            <w:r>
+              <w:rPr>
+                <w:sz w:val="22"/>
+                <w:szCs w:val="22"/>
+              </w:rPr>
+            </w:r>
+            <w:r>
+              <w:rPr>
+                <w:sz w:val="22"/>
+                <w:szCs w:val="22"/>
+              </w:rPr>
+            </w:r>
+          </w:p>
+        </w:tc>
+        <w:tc>
+          <w:tcPr>
+            <w:tcW w:w="3710" w:type="pct"/>
+            <w:shd w:val="clear" w:color="auto" w:fill="auto"/>
+            <w:vAlign w:val="center"/>
+          </w:tcPr>
+          <w:p>
+            <w:pPr>
+              <w:jc w:val="both"/>
+            </w:pPr>
+            <w:r>
+              <w:t>Ch. 6 — Merchandise Inventory</w:t>
             </w:r>
             <w:r>
               <w:rPr>
                 <w:b/>
                 <w:color w:val="C00000"/>
               </w:rPr>
-              <w:t xml:space="preserve">   (Ch. 3 Assignment &amp; Quiz#3 due 09/27)</w:t>
+              <w:t xml:space="preserve">   (Ch. 6 Assignment &amp; Quiz#6 due 10/26)</w:t>
             </w:r>
           </w:p>
         </w:tc>
@@ -5991,7 +6684,7 @@
                 <w:szCs w:val="22"/>
                 <w:lang w:eastAsia="ko-KR"/>
               </w:rPr>
-              <w:t>12</w:t>
+              <w:t>20</w:t>
             </w:r>
           </w:p>
         </w:tc>
@@ -6014,7 +6707,7 @@
                 <w:sz w:val="22"/>
                 <w:szCs w:val="22"/>
               </w:rPr>
-              <w:t>09/29 (Tue)</w:t>
+              <w:t>10/27 (Tue)</w:t>
             </w:r>
             <w:r>
               <w:rPr>
@@ -6047,7 +6740,7 @@
               <w:jc w:val="both"/>
             </w:pPr>
             <w:r>
-              <w:t>Ch. 4 — Completing the Accounting Cycle</w:t>
+              <w:t>Ch. 7 — Internal Control and Cash</w:t>
             </w:r>
           </w:p>
         </w:tc>
@@ -6073,7 +6766,7 @@
                 <w:szCs w:val="22"/>
                 <w:lang w:eastAsia="ko-KR"/>
               </w:rPr>
-              <w:t>13</w:t>
+              <w:t>21</w:t>
             </w:r>
           </w:p>
         </w:tc>
@@ -6096,7 +6789,7 @@
                 <w:sz w:val="22"/>
                 <w:szCs w:val="22"/>
               </w:rPr>
-              <w:t>10/01 (Thu)</w:t>
+              <w:t>10/29 (Thu)</w:t>
             </w:r>
             <w:r>
               <w:rPr>
@@ -6129,14 +6822,14 @@
               <w:jc w:val="both"/>
             </w:pPr>
             <w:r>
-              <w:t>Ch. 4 — Completing the Accounting Cycle</w:t>
+              <w:t>Ch. 8 — Receivables</w:t>
             </w:r>
             <w:r>
               <w:rPr>
                 <w:b/>
                 <w:color w:val="C00000"/>
               </w:rPr>
-              <w:t xml:space="preserve">   (Ch. 4 Assignment &amp; Quiz#4 due 10/04)</w:t>
+              <w:t xml:space="preserve">   (Ch. 7 Assignment &amp; Quiz#7 due 11/02)</w:t>
             </w:r>
           </w:p>
         </w:tc>
@@ -6162,7 +6855,7 @@
                 <w:szCs w:val="22"/>
                 <w:lang w:eastAsia="ko-KR"/>
               </w:rPr>
-              <w:t>14</w:t>
+              <w:t>22</w:t>
             </w:r>
           </w:p>
         </w:tc>
@@ -6185,7 +6878,7 @@
                 <w:sz w:val="22"/>
                 <w:szCs w:val="22"/>
               </w:rPr>
-              <w:t>10/06 (Tue)</w:t>
+              <w:t>11/03 (Tue)</w:t>
             </w:r>
             <w:r>
               <w:rPr>
@@ -6218,7 +6911,7 @@
               <w:jc w:val="both"/>
             </w:pPr>
             <w:r>
-              <w:t>Ch. 3 &amp; 4 Review</w:t>
+              <w:t>Ch. 8 — Receivables</w:t>
             </w:r>
           </w:p>
         </w:tc>
@@ -6244,7 +6937,7 @@
                 <w:szCs w:val="22"/>
                 <w:lang w:eastAsia="ko-KR"/>
               </w:rPr>
-              <w:t>15</w:t>
+              <w:t>23</w:t>
             </w:r>
           </w:p>
         </w:tc>
@@ -6267,7 +6960,7 @@
                 <w:sz w:val="22"/>
                 <w:szCs w:val="22"/>
               </w:rPr>
-              <w:t>10/08 (Thu)</w:t>
+              <w:t>11/05 (Thu)</w:t>
             </w:r>
             <w:r>
               <w:rPr>
@@ -6300,7 +6993,96 @@
               <w:jc w:val="both"/>
             </w:pPr>
             <w:r>
-              <w:t>2nd Exam: Ch. 3 &amp; 4</w:t>
+              <w:t>Ch. 5–8 Review</w:t>
+            </w:r>
+            <w:r>
+              <w:rPr>
+                <w:b/>
+                <w:color w:val="C00000"/>
+              </w:rPr>
+              <w:t xml:space="preserve">   (Ch. 8 Assignment &amp; Quiz#8 due 11/09)</w:t>
+            </w:r>
+          </w:p>
+        </w:tc>
+      </w:tr>
+      <w:tr>
+        <w:tc>
+          <w:tcPr>
+            <w:tcW w:w="440" w:type="pct"/>
+            <w:shd w:val="clear" w:color="auto" w:fill="auto"/>
+            <w:vAlign w:val="center"/>
+          </w:tcPr>
+          <w:p>
+            <w:pPr>
+              <w:jc w:val="center"/>
+              <w:rPr>
+                <w:lang w:eastAsia="ko-KR"/>
+              </w:rPr>
+            </w:pPr>
+            <w:r>
+              <w:rPr>
+                <w:rFonts w:hint="eastAsia"/>
+                <w:sz w:val="22"/>
+                <w:szCs w:val="22"/>
+                <w:lang w:eastAsia="ko-KR"/>
+              </w:rPr>
+              <w:t>24</w:t>
+            </w:r>
+          </w:p>
+        </w:tc>
+        <w:tc>
+          <w:tcPr>
+            <w:tcW w:w="850" w:type="pct"/>
+            <w:shd w:val="clear" w:color="auto" w:fill="auto"/>
+            <w:vAlign w:val="center"/>
+          </w:tcPr>
+          <w:p>
+            <w:pPr>
+              <w:ind w:rightChars="31" w:right="62"/>
+              <w:jc w:val="center"/>
+              <w:rPr>
+                <w:lang w:eastAsia="ko-KR"/>
+              </w:rPr>
+            </w:pPr>
+            <w:r>
+              <w:rPr>
+                <w:sz w:val="22"/>
+                <w:szCs w:val="22"/>
+              </w:rPr>
+              <w:t>11/10 (Tue)</w:t>
+            </w:r>
+            <w:r>
+              <w:rPr>
+                <w:sz w:val="22"/>
+                <w:szCs w:val="22"/>
+              </w:rPr>
+            </w:r>
+            <w:r>
+              <w:rPr>
+                <w:sz w:val="22"/>
+                <w:szCs w:val="22"/>
+              </w:rPr>
+            </w:r>
+            <w:r>
+              <w:rPr>
+                <w:sz w:val="22"/>
+                <w:szCs w:val="22"/>
+              </w:rPr>
+            </w:r>
+          </w:p>
+        </w:tc>
+        <w:tc>
+          <w:tcPr>
+            <w:tcW w:w="3710" w:type="pct"/>
+            <w:shd w:val="clear" w:color="auto" w:fill="auto"/>
+            <w:vAlign w:val="center"/>
+          </w:tcPr>
+          <w:p>
+            <w:pPr>
+              <w:jc w:val="both"/>
+            </w:pPr>
+            <w:r>
+              <w:t>3rd Exam: Ch. 5, 6, 7 &amp; 8</w:t>
             </w:r>
             <w:r>
               <w:rPr>
@@ -6333,7 +7115,7 @@
                 <w:szCs w:val="22"/>
                 <w:lang w:eastAsia="ko-KR"/>
               </w:rPr>
-              <w:t>16</w:t>
+              <w:t>25</w:t>
             </w:r>
           </w:p>
         </w:tc>
@@ -6356,7 +7138,7 @@
                 <w:sz w:val="22"/>
                 <w:szCs w:val="22"/>
               </w:rPr>
-              <w:t>10/13 (Tue)</w:t>
+              <w:t>11/12 (Thu)</w:t>
             </w:r>
             <w:r>
               <w:rPr>
@@ -6389,7 +7171,7 @@
               <w:jc w:val="both"/>
             </w:pPr>
             <w:r>
-              <w:t>Ch. 5 — Merchandising Operations</w:t>
+              <w:t>Ch. 9 — Plant Assets, Natural Resources, and Intangibles</w:t>
             </w:r>
           </w:p>
         </w:tc>
@@ -6415,7 +7197,7 @@
                 <w:szCs w:val="22"/>
                 <w:lang w:eastAsia="ko-KR"/>
               </w:rPr>
-              <w:t>17</w:t>
+              <w:t>26</w:t>
             </w:r>
           </w:p>
         </w:tc>
@@ -6438,7 +7220,7 @@
                 <w:sz w:val="22"/>
                 <w:szCs w:val="22"/>
               </w:rPr>
-              <w:t>10/15 (Thu)</w:t>
+              <w:t>11/17 (Tue)</w:t>
             </w:r>
             <w:r>
               <w:rPr>
@@ -6471,14 +7253,14 @@
               <w:jc w:val="both"/>
             </w:pPr>
             <w:r>
-              <w:t>Ch. 5 — Merchandising Operations</w:t>
+              <w:t>Ch. 11 — Current Liabilities</w:t>
             </w:r>
             <w:r>
               <w:rPr>
                 <w:b/>
                 <w:color w:val="C00000"/>
               </w:rPr>
-              <w:t xml:space="preserve">   (Ch. 5 Assignment &amp; Quiz#5 due 10/18)</w:t>
+              <w:t xml:space="preserve">   (Ch. 9 Assignment &amp; Quiz#9 due 11/18)</w:t>
             </w:r>
           </w:p>
         </w:tc>
@@ -6504,7 +7286,7 @@
                 <w:szCs w:val="22"/>
                 <w:lang w:eastAsia="ko-KR"/>
               </w:rPr>
-              <w:t>18</w:t>
+              <w:t>27</w:t>
             </w:r>
           </w:p>
         </w:tc>
@@ -6527,7 +7309,7 @@
                 <w:sz w:val="22"/>
                 <w:szCs w:val="22"/>
               </w:rPr>
-              <w:t>10/20 (Tue)</w:t>
+              <w:t>11/19 (Thu)</w:t>
             </w:r>
             <w:r>
               <w:rPr>
@@ -6560,14 +7342,14 @@
               <w:jc w:val="both"/>
             </w:pPr>
             <w:r>
-              <w:t>Ch. 6 — Merchandise Inventory</w:t>
+              <w:t>Ch. 12 — Long-Term Liabilities</w:t>
             </w:r>
             <w:r>
               <w:rPr>
                 <w:b/>
-                <w:color w:val="00B050"/>
-              </w:rPr>
-              <w:t xml:space="preserve">   (10/21 — Last day to withdraw with a “W”)</w:t>
+                <w:color w:val="C00000"/>
+              </w:rPr>
+              <w:t xml:space="preserve">   (Ch. 11 Assignment &amp; Quiz#10 due 11/23)</w:t>
             </w:r>
           </w:p>
         </w:tc>
@@ -6593,7 +7375,7 @@
                 <w:szCs w:val="22"/>
                 <w:lang w:eastAsia="ko-KR"/>
               </w:rPr>
-              <w:t>19</w:t>
+              <w:t>28</w:t>
             </w:r>
           </w:p>
         </w:tc>
@@ -6616,7 +7398,7 @@
                 <w:sz w:val="22"/>
                 <w:szCs w:val="22"/>
               </w:rPr>
-              <w:t>10/22 (Thu)</w:t>
+              <w:t>11/24 (Tue)</w:t>
             </w:r>
             <w:r>
               <w:rPr>
@@ -6649,794 +7431,14 @@
               <w:jc w:val="both"/>
             </w:pPr>
             <w:r>
-              <w:t>Ch. 6 — Merchandise Inventory</w:t>
+              <w:t>Ch. 13 — Stockholders' Equity; Comprehensive Course Review</w:t>
             </w:r>
             <w:r>
               <w:rPr>
                 <w:b/>
                 <w:color w:val="C00000"/>
               </w:rPr>
-              <w:t xml:space="preserve">   (Ch. 6 Assignment &amp; Quiz#6 due 10/25)</w:t>
-            </w:r>
-          </w:p>
-        </w:tc>
-      </w:tr>
-      <w:tr>
-        <w:tc>
-          <w:tcPr>
-            <w:tcW w:w="440" w:type="pct"/>
-            <w:shd w:val="clear" w:color="auto" w:fill="auto"/>
-            <w:vAlign w:val="center"/>
-          </w:tcPr>
-          <w:p>
-            <w:pPr>
-              <w:jc w:val="center"/>
-              <w:rPr>
-                <w:lang w:eastAsia="ko-KR"/>
-              </w:rPr>
-            </w:pPr>
-            <w:r>
-              <w:rPr>
-                <w:rFonts w:hint="eastAsia"/>
-                <w:sz w:val="22"/>
-                <w:szCs w:val="22"/>
-                <w:lang w:eastAsia="ko-KR"/>
-              </w:rPr>
-              <w:t>20</w:t>
-            </w:r>
-          </w:p>
-        </w:tc>
-        <w:tc>
-          <w:tcPr>
-            <w:tcW w:w="850" w:type="pct"/>
-            <w:shd w:val="clear" w:color="auto" w:fill="auto"/>
-            <w:vAlign w:val="center"/>
-          </w:tcPr>
-          <w:p>
-            <w:pPr>
-              <w:ind w:rightChars="31" w:right="62"/>
-              <w:jc w:val="center"/>
-              <w:rPr>
-                <w:lang w:eastAsia="ko-KR"/>
-              </w:rPr>
-            </w:pPr>
-            <w:r>
-              <w:rPr>
-                <w:sz w:val="22"/>
-                <w:szCs w:val="22"/>
-              </w:rPr>
-              <w:t>10/27 (Tue)</w:t>
-            </w:r>
-            <w:r>
-              <w:rPr>
-                <w:sz w:val="22"/>
-                <w:szCs w:val="22"/>
-              </w:rPr>
-            </w:r>
-            <w:r>
-              <w:rPr>
-                <w:sz w:val="22"/>
-                <w:szCs w:val="22"/>
-              </w:rPr>
-            </w:r>
-            <w:r>
-              <w:rPr>
-                <w:sz w:val="22"/>
-                <w:szCs w:val="22"/>
-              </w:rPr>
-            </w:r>
-          </w:p>
-        </w:tc>
-        <w:tc>
-          <w:tcPr>
-            <w:tcW w:w="3710" w:type="pct"/>
-            <w:shd w:val="clear" w:color="auto" w:fill="auto"/>
-            <w:vAlign w:val="center"/>
-          </w:tcPr>
-          <w:p>
-            <w:pPr>
-              <w:jc w:val="both"/>
-            </w:pPr>
-            <w:r>
-              <w:t>Ch. 7 — Internal Control and Cash</w:t>
-            </w:r>
-          </w:p>
-        </w:tc>
-      </w:tr>
-      <w:tr>
-        <w:tc>
-          <w:tcPr>
-            <w:tcW w:w="440" w:type="pct"/>
-            <w:shd w:val="clear" w:color="auto" w:fill="auto"/>
-            <w:vAlign w:val="center"/>
-          </w:tcPr>
-          <w:p>
-            <w:pPr>
-              <w:jc w:val="center"/>
-              <w:rPr>
-                <w:lang w:eastAsia="ko-KR"/>
-              </w:rPr>
-            </w:pPr>
-            <w:r>
-              <w:rPr>
-                <w:rFonts w:hint="eastAsia"/>
-                <w:sz w:val="22"/>
-                <w:szCs w:val="22"/>
-                <w:lang w:eastAsia="ko-KR"/>
-              </w:rPr>
-              <w:t>21</w:t>
-            </w:r>
-          </w:p>
-        </w:tc>
-        <w:tc>
-          <w:tcPr>
-            <w:tcW w:w="850" w:type="pct"/>
-            <w:shd w:val="clear" w:color="auto" w:fill="auto"/>
-            <w:vAlign w:val="center"/>
-          </w:tcPr>
-          <w:p>
-            <w:pPr>
-              <w:ind w:rightChars="31" w:right="62"/>
-              <w:jc w:val="center"/>
-              <w:rPr>
-                <w:lang w:eastAsia="ko-KR"/>
-              </w:rPr>
-            </w:pPr>
-            <w:r>
-              <w:rPr>
-                <w:sz w:val="22"/>
-                <w:szCs w:val="22"/>
-              </w:rPr>
-              <w:t>10/29 (Thu)</w:t>
-            </w:r>
-            <w:r>
-              <w:rPr>
-                <w:sz w:val="22"/>
-                <w:szCs w:val="22"/>
-              </w:rPr>
-            </w:r>
-            <w:r>
-              <w:rPr>
-                <w:sz w:val="22"/>
-                <w:szCs w:val="22"/>
-              </w:rPr>
-            </w:r>
-            <w:r>
-              <w:rPr>
-                <w:sz w:val="22"/>
-                <w:szCs w:val="22"/>
-              </w:rPr>
-            </w:r>
-          </w:p>
-        </w:tc>
-        <w:tc>
-          <w:tcPr>
-            <w:tcW w:w="3710" w:type="pct"/>
-            <w:shd w:val="clear" w:color="auto" w:fill="auto"/>
-            <w:vAlign w:val="center"/>
-          </w:tcPr>
-          <w:p>
-            <w:pPr>
-              <w:jc w:val="both"/>
-            </w:pPr>
-            <w:r>
-              <w:t>Ch. 8 — Receivables</w:t>
-            </w:r>
-            <w:r>
-              <w:rPr>
-                <w:b/>
-                <w:color w:val="C00000"/>
-              </w:rPr>
-              <w:t xml:space="preserve">   (Ch. 7 Assignment &amp; Quiz#7 due 11/01)</w:t>
-            </w:r>
-          </w:p>
-        </w:tc>
-      </w:tr>
-      <w:tr>
-        <w:tc>
-          <w:tcPr>
-            <w:tcW w:w="440" w:type="pct"/>
-            <w:shd w:val="clear" w:color="auto" w:fill="auto"/>
-            <w:vAlign w:val="center"/>
-          </w:tcPr>
-          <w:p>
-            <w:pPr>
-              <w:jc w:val="center"/>
-              <w:rPr>
-                <w:lang w:eastAsia="ko-KR"/>
-              </w:rPr>
-            </w:pPr>
-            <w:r>
-              <w:rPr>
-                <w:rFonts w:hint="eastAsia"/>
-                <w:sz w:val="22"/>
-                <w:szCs w:val="22"/>
-                <w:lang w:eastAsia="ko-KR"/>
-              </w:rPr>
-              <w:t>22</w:t>
-            </w:r>
-          </w:p>
-        </w:tc>
-        <w:tc>
-          <w:tcPr>
-            <w:tcW w:w="850" w:type="pct"/>
-            <w:shd w:val="clear" w:color="auto" w:fill="auto"/>
-            <w:vAlign w:val="center"/>
-          </w:tcPr>
-          <w:p>
-            <w:pPr>
-              <w:ind w:rightChars="31" w:right="62"/>
-              <w:jc w:val="center"/>
-              <w:rPr>
-                <w:lang w:eastAsia="ko-KR"/>
-              </w:rPr>
-            </w:pPr>
-            <w:r>
-              <w:rPr>
-                <w:sz w:val="22"/>
-                <w:szCs w:val="22"/>
-              </w:rPr>
-              <w:t>11/03 (Tue)</w:t>
-            </w:r>
-            <w:r>
-              <w:rPr>
-                <w:sz w:val="22"/>
-                <w:szCs w:val="22"/>
-              </w:rPr>
-            </w:r>
-            <w:r>
-              <w:rPr>
-                <w:sz w:val="22"/>
-                <w:szCs w:val="22"/>
-              </w:rPr>
-            </w:r>
-            <w:r>
-              <w:rPr>
-                <w:sz w:val="22"/>
-                <w:szCs w:val="22"/>
-              </w:rPr>
-            </w:r>
-          </w:p>
-        </w:tc>
-        <w:tc>
-          <w:tcPr>
-            <w:tcW w:w="3710" w:type="pct"/>
-            <w:shd w:val="clear" w:color="auto" w:fill="auto"/>
-            <w:vAlign w:val="center"/>
-          </w:tcPr>
-          <w:p>
-            <w:pPr>
-              <w:jc w:val="both"/>
-            </w:pPr>
-            <w:r>
-              <w:t>Ch. 8 — Receivables</w:t>
-            </w:r>
-          </w:p>
-        </w:tc>
-      </w:tr>
-      <w:tr>
-        <w:tc>
-          <w:tcPr>
-            <w:tcW w:w="440" w:type="pct"/>
-            <w:shd w:val="clear" w:color="auto" w:fill="auto"/>
-            <w:vAlign w:val="center"/>
-          </w:tcPr>
-          <w:p>
-            <w:pPr>
-              <w:jc w:val="center"/>
-              <w:rPr>
-                <w:lang w:eastAsia="ko-KR"/>
-              </w:rPr>
-            </w:pPr>
-            <w:r>
-              <w:rPr>
-                <w:rFonts w:hint="eastAsia"/>
-                <w:sz w:val="22"/>
-                <w:szCs w:val="22"/>
-                <w:lang w:eastAsia="ko-KR"/>
-              </w:rPr>
-              <w:t>23</w:t>
-            </w:r>
-          </w:p>
-        </w:tc>
-        <w:tc>
-          <w:tcPr>
-            <w:tcW w:w="850" w:type="pct"/>
-            <w:shd w:val="clear" w:color="auto" w:fill="auto"/>
-            <w:vAlign w:val="center"/>
-          </w:tcPr>
-          <w:p>
-            <w:pPr>
-              <w:ind w:rightChars="31" w:right="62"/>
-              <w:jc w:val="center"/>
-              <w:rPr>
-                <w:lang w:eastAsia="ko-KR"/>
-              </w:rPr>
-            </w:pPr>
-            <w:r>
-              <w:rPr>
-                <w:sz w:val="22"/>
-                <w:szCs w:val="22"/>
-              </w:rPr>
-              <w:t>11/05 (Thu)</w:t>
-            </w:r>
-            <w:r>
-              <w:rPr>
-                <w:sz w:val="22"/>
-                <w:szCs w:val="22"/>
-              </w:rPr>
-            </w:r>
-            <w:r>
-              <w:rPr>
-                <w:sz w:val="22"/>
-                <w:szCs w:val="22"/>
-              </w:rPr>
-            </w:r>
-            <w:r>
-              <w:rPr>
-                <w:sz w:val="22"/>
-                <w:szCs w:val="22"/>
-              </w:rPr>
-            </w:r>
-          </w:p>
-        </w:tc>
-        <w:tc>
-          <w:tcPr>
-            <w:tcW w:w="3710" w:type="pct"/>
-            <w:shd w:val="clear" w:color="auto" w:fill="auto"/>
-            <w:vAlign w:val="center"/>
-          </w:tcPr>
-          <w:p>
-            <w:pPr>
-              <w:jc w:val="both"/>
-            </w:pPr>
-            <w:r>
-              <w:t>Ch. 5–8 Review</w:t>
-            </w:r>
-            <w:r>
-              <w:rPr>
-                <w:b/>
-                <w:color w:val="C00000"/>
-              </w:rPr>
-              <w:t xml:space="preserve">   (Ch. 8 Assignment &amp; Quiz#8 due 11/08)</w:t>
-            </w:r>
-          </w:p>
-        </w:tc>
-      </w:tr>
-      <w:tr>
-        <w:tc>
-          <w:tcPr>
-            <w:tcW w:w="440" w:type="pct"/>
-            <w:shd w:val="clear" w:color="auto" w:fill="auto"/>
-            <w:vAlign w:val="center"/>
-          </w:tcPr>
-          <w:p>
-            <w:pPr>
-              <w:jc w:val="center"/>
-              <w:rPr>
-                <w:lang w:eastAsia="ko-KR"/>
-              </w:rPr>
-            </w:pPr>
-            <w:r>
-              <w:rPr>
-                <w:rFonts w:hint="eastAsia"/>
-                <w:sz w:val="22"/>
-                <w:szCs w:val="22"/>
-                <w:lang w:eastAsia="ko-KR"/>
-              </w:rPr>
-              <w:t>24</w:t>
-            </w:r>
-          </w:p>
-        </w:tc>
-        <w:tc>
-          <w:tcPr>
-            <w:tcW w:w="850" w:type="pct"/>
-            <w:shd w:val="clear" w:color="auto" w:fill="auto"/>
-            <w:vAlign w:val="center"/>
-          </w:tcPr>
-          <w:p>
-            <w:pPr>
-              <w:ind w:rightChars="31" w:right="62"/>
-              <w:jc w:val="center"/>
-              <w:rPr>
-                <w:lang w:eastAsia="ko-KR"/>
-              </w:rPr>
-            </w:pPr>
-            <w:r>
-              <w:rPr>
-                <w:sz w:val="22"/>
-                <w:szCs w:val="22"/>
-              </w:rPr>
-              <w:t>11/10 (Tue)</w:t>
-            </w:r>
-            <w:r>
-              <w:rPr>
-                <w:sz w:val="22"/>
-                <w:szCs w:val="22"/>
-              </w:rPr>
-            </w:r>
-            <w:r>
-              <w:rPr>
-                <w:sz w:val="22"/>
-                <w:szCs w:val="22"/>
-              </w:rPr>
-            </w:r>
-            <w:r>
-              <w:rPr>
-                <w:sz w:val="22"/>
-                <w:szCs w:val="22"/>
-              </w:rPr>
-            </w:r>
-          </w:p>
-        </w:tc>
-        <w:tc>
-          <w:tcPr>
-            <w:tcW w:w="3710" w:type="pct"/>
-            <w:shd w:val="clear" w:color="auto" w:fill="auto"/>
-            <w:vAlign w:val="center"/>
-          </w:tcPr>
-          <w:p>
-            <w:pPr>
-              <w:jc w:val="both"/>
-            </w:pPr>
-            <w:r>
-              <w:t>3rd Exam: Ch. 5, 6, 7 &amp; 8</w:t>
-            </w:r>
-            <w:r>
-              <w:rPr>
-                <w:b/>
-                <w:color w:val="0070C0"/>
-              </w:rPr>
-              <w:t xml:space="preserve">   (IN PERSON — bring laptop &amp; student ID)</w:t>
-            </w:r>
-          </w:p>
-        </w:tc>
-      </w:tr>
-      <w:tr>
-        <w:tc>
-          <w:tcPr>
-            <w:tcW w:w="440" w:type="pct"/>
-            <w:shd w:val="clear" w:color="auto" w:fill="auto"/>
-            <w:vAlign w:val="center"/>
-          </w:tcPr>
-          <w:p>
-            <w:pPr>
-              <w:jc w:val="center"/>
-              <w:rPr>
-                <w:lang w:eastAsia="ko-KR"/>
-              </w:rPr>
-            </w:pPr>
-            <w:r>
-              <w:rPr>
-                <w:rFonts w:hint="eastAsia"/>
-                <w:sz w:val="22"/>
-                <w:szCs w:val="22"/>
-                <w:lang w:eastAsia="ko-KR"/>
-              </w:rPr>
-              <w:t>25</w:t>
-            </w:r>
-          </w:p>
-        </w:tc>
-        <w:tc>
-          <w:tcPr>
-            <w:tcW w:w="850" w:type="pct"/>
-            <w:shd w:val="clear" w:color="auto" w:fill="auto"/>
-            <w:vAlign w:val="center"/>
-          </w:tcPr>
-          <w:p>
-            <w:pPr>
-              <w:ind w:rightChars="31" w:right="62"/>
-              <w:jc w:val="center"/>
-              <w:rPr>
-                <w:lang w:eastAsia="ko-KR"/>
-              </w:rPr>
-            </w:pPr>
-            <w:r>
-              <w:rPr>
-                <w:sz w:val="22"/>
-                <w:szCs w:val="22"/>
-              </w:rPr>
-              <w:t>11/12 (Thu)</w:t>
-            </w:r>
-            <w:r>
-              <w:rPr>
-                <w:sz w:val="22"/>
-                <w:szCs w:val="22"/>
-              </w:rPr>
-            </w:r>
-            <w:r>
-              <w:rPr>
-                <w:sz w:val="22"/>
-                <w:szCs w:val="22"/>
-              </w:rPr>
-            </w:r>
-            <w:r>
-              <w:rPr>
-                <w:sz w:val="22"/>
-                <w:szCs w:val="22"/>
-              </w:rPr>
-            </w:r>
-          </w:p>
-        </w:tc>
-        <w:tc>
-          <w:tcPr>
-            <w:tcW w:w="3710" w:type="pct"/>
-            <w:shd w:val="clear" w:color="auto" w:fill="auto"/>
-            <w:vAlign w:val="center"/>
-          </w:tcPr>
-          <w:p>
-            <w:pPr>
-              <w:jc w:val="both"/>
-            </w:pPr>
-            <w:r>
-              <w:t>Ch. 9 — Plant Assets, Natural Resources, and Intangibles</w:t>
-            </w:r>
-            <w:r>
-              <w:rPr>
-                <w:b/>
-                <w:color w:val="C00000"/>
-              </w:rPr>
-              <w:t xml:space="preserve">   (Ch. 9 Assignment &amp; Quiz#9 due 11/15)</w:t>
-            </w:r>
-          </w:p>
-        </w:tc>
-      </w:tr>
-      <w:tr>
-        <w:tc>
-          <w:tcPr>
-            <w:tcW w:w="440" w:type="pct"/>
-            <w:shd w:val="clear" w:color="auto" w:fill="auto"/>
-            <w:vAlign w:val="center"/>
-          </w:tcPr>
-          <w:p>
-            <w:pPr>
-              <w:jc w:val="center"/>
-              <w:rPr>
-                <w:lang w:eastAsia="ko-KR"/>
-              </w:rPr>
-            </w:pPr>
-            <w:r>
-              <w:rPr>
-                <w:rFonts w:hint="eastAsia"/>
-                <w:sz w:val="22"/>
-                <w:szCs w:val="22"/>
-                <w:lang w:eastAsia="ko-KR"/>
-              </w:rPr>
-              <w:t>26</w:t>
-            </w:r>
-          </w:p>
-        </w:tc>
-        <w:tc>
-          <w:tcPr>
-            <w:tcW w:w="850" w:type="pct"/>
-            <w:shd w:val="clear" w:color="auto" w:fill="auto"/>
-            <w:vAlign w:val="center"/>
-          </w:tcPr>
-          <w:p>
-            <w:pPr>
-              <w:ind w:rightChars="31" w:right="62"/>
-              <w:jc w:val="center"/>
-              <w:rPr>
-                <w:lang w:eastAsia="ko-KR"/>
-              </w:rPr>
-            </w:pPr>
-            <w:r>
-              <w:rPr>
-                <w:sz w:val="22"/>
-                <w:szCs w:val="22"/>
-              </w:rPr>
-              <w:t>11/17 (Tue)</w:t>
-            </w:r>
-            <w:r>
-              <w:rPr>
-                <w:sz w:val="22"/>
-                <w:szCs w:val="22"/>
-              </w:rPr>
-            </w:r>
-            <w:r>
-              <w:rPr>
-                <w:sz w:val="22"/>
-                <w:szCs w:val="22"/>
-              </w:rPr>
-            </w:r>
-            <w:r>
-              <w:rPr>
-                <w:sz w:val="22"/>
-                <w:szCs w:val="22"/>
-              </w:rPr>
-            </w:r>
-          </w:p>
-        </w:tc>
-        <w:tc>
-          <w:tcPr>
-            <w:tcW w:w="3710" w:type="pct"/>
-            <w:shd w:val="clear" w:color="auto" w:fill="auto"/>
-            <w:vAlign w:val="center"/>
-          </w:tcPr>
-          <w:p>
-            <w:pPr>
-              <w:jc w:val="both"/>
-            </w:pPr>
-            <w:r>
-              <w:t>Ch. 11 — Current Liabilities</w:t>
-            </w:r>
-          </w:p>
-        </w:tc>
-      </w:tr>
-      <w:tr>
-        <w:tc>
-          <w:tcPr>
-            <w:tcW w:w="440" w:type="pct"/>
-            <w:shd w:val="clear" w:color="auto" w:fill="auto"/>
-            <w:vAlign w:val="center"/>
-          </w:tcPr>
-          <w:p>
-            <w:pPr>
-              <w:jc w:val="center"/>
-              <w:rPr>
-                <w:lang w:eastAsia="ko-KR"/>
-              </w:rPr>
-            </w:pPr>
-            <w:r>
-              <w:rPr>
-                <w:rFonts w:hint="eastAsia"/>
-                <w:sz w:val="22"/>
-                <w:szCs w:val="22"/>
-                <w:lang w:eastAsia="ko-KR"/>
-              </w:rPr>
-              <w:t>27</w:t>
-            </w:r>
-          </w:p>
-        </w:tc>
-        <w:tc>
-          <w:tcPr>
-            <w:tcW w:w="850" w:type="pct"/>
-            <w:shd w:val="clear" w:color="auto" w:fill="auto"/>
-            <w:vAlign w:val="center"/>
-          </w:tcPr>
-          <w:p>
-            <w:pPr>
-              <w:ind w:rightChars="31" w:right="62"/>
-              <w:jc w:val="center"/>
-              <w:rPr>
-                <w:lang w:eastAsia="ko-KR"/>
-              </w:rPr>
-            </w:pPr>
-            <w:r>
-              <w:rPr>
-                <w:sz w:val="22"/>
-                <w:szCs w:val="22"/>
-              </w:rPr>
-              <w:t>11/19 (Thu)</w:t>
-            </w:r>
-            <w:r>
-              <w:rPr>
-                <w:sz w:val="22"/>
-                <w:szCs w:val="22"/>
-              </w:rPr>
-            </w:r>
-            <w:r>
-              <w:rPr>
-                <w:sz w:val="22"/>
-                <w:szCs w:val="22"/>
-              </w:rPr>
-            </w:r>
-            <w:r>
-              <w:rPr>
-                <w:sz w:val="22"/>
-                <w:szCs w:val="22"/>
-              </w:rPr>
-            </w:r>
-          </w:p>
-        </w:tc>
-        <w:tc>
-          <w:tcPr>
-            <w:tcW w:w="3710" w:type="pct"/>
-            <w:shd w:val="clear" w:color="auto" w:fill="auto"/>
-            <w:vAlign w:val="center"/>
-          </w:tcPr>
-          <w:p>
-            <w:pPr>
-              <w:jc w:val="both"/>
-            </w:pPr>
-            <w:r>
-              <w:t>Ch. 12 — Long-Term Liabilities</w:t>
-            </w:r>
-            <w:r>
-              <w:rPr>
-                <w:b/>
-                <w:color w:val="C00000"/>
-              </w:rPr>
-              <w:t xml:space="preserve">   (Ch. 11 Assignment &amp; Quiz#10 due 11/22)</w:t>
-            </w:r>
-          </w:p>
-        </w:tc>
-      </w:tr>
-      <w:tr>
-        <w:tc>
-          <w:tcPr>
-            <w:tcW w:w="440" w:type="pct"/>
-            <w:shd w:val="clear" w:color="auto" w:fill="auto"/>
-            <w:vAlign w:val="center"/>
-          </w:tcPr>
-          <w:p>
-            <w:pPr>
-              <w:jc w:val="center"/>
-              <w:rPr>
-                <w:lang w:eastAsia="ko-KR"/>
-              </w:rPr>
-            </w:pPr>
-            <w:r>
-              <w:rPr>
-                <w:rFonts w:hint="eastAsia"/>
-                <w:sz w:val="22"/>
-                <w:szCs w:val="22"/>
-                <w:lang w:eastAsia="ko-KR"/>
-              </w:rPr>
-              <w:t>28</w:t>
-            </w:r>
-          </w:p>
-        </w:tc>
-        <w:tc>
-          <w:tcPr>
-            <w:tcW w:w="850" w:type="pct"/>
-            <w:shd w:val="clear" w:color="auto" w:fill="auto"/>
-            <w:vAlign w:val="center"/>
-          </w:tcPr>
-          <w:p>
-            <w:pPr>
-              <w:ind w:rightChars="31" w:right="62"/>
-              <w:jc w:val="center"/>
-              <w:rPr>
-                <w:lang w:eastAsia="ko-KR"/>
-              </w:rPr>
-            </w:pPr>
-            <w:r>
-              <w:rPr>
-                <w:sz w:val="22"/>
-                <w:szCs w:val="22"/>
-              </w:rPr>
-              <w:t>11/24 (Tue)</w:t>
-            </w:r>
-            <w:r>
-              <w:rPr>
-                <w:sz w:val="22"/>
-                <w:szCs w:val="22"/>
-              </w:rPr>
-            </w:r>
-            <w:r>
-              <w:rPr>
-                <w:sz w:val="22"/>
-                <w:szCs w:val="22"/>
-              </w:rPr>
-            </w:r>
-            <w:r>
-              <w:rPr>
-                <w:sz w:val="22"/>
-                <w:szCs w:val="22"/>
-              </w:rPr>
-            </w:r>
-          </w:p>
-        </w:tc>
-        <w:tc>
-          <w:tcPr>
-            <w:tcW w:w="3710" w:type="pct"/>
-            <w:shd w:val="clear" w:color="auto" w:fill="auto"/>
-            <w:vAlign w:val="center"/>
-          </w:tcPr>
-          <w:p>
-            <w:pPr>
-              <w:jc w:val="both"/>
-            </w:pPr>
-            <w:r>
-              <w:t>Ch. 13 — Stockholders' Equity; Comprehensive Course Review</w:t>
-            </w:r>
-            <w:r>
-              <w:rPr>
-                <w:b/>
-                <w:color w:val="C00000"/>
-              </w:rPr>
-              <w:t xml:space="preserve">   (Ch. 12 Assignment &amp; Quiz#11 due 11/29; Ch. 13 Assignment &amp; Quiz#12 due 11/29)</w:t>
+              <w:t xml:space="preserve">   (Ch. 12 Assignment &amp; Quiz#11 due 11/25; Ch. 13 Assignment &amp; Quiz#12 due 11/30)</w:t>
             </w:r>
           </w:p>
         </w:tc>

</xml_diff>